<commit_message>
Deck and walkthrough read the same numbers, each with its set and instrument
</commit_message>
<xml_diff>
--- a/deliverables/checkbox-code-walkthrough.docx
+++ b/deliverables/checkbox-code-walkthrough.docx
@@ -2125,33 +2125,7 @@
           <w:color w:val="18181B"/>
           <w:sz w:val="20"/>
         </w:rPr>
-        <w:t>The close-up crops a person ruled before any threshold was tuned: 36 of 39 hard-graded cards agree.</w:t>
-      </w:r>
-    </w:p>
-    <w:p>
-      <w:pPr>
-        <w:spacing w:before="20" w:after="60"/>
-        <w:ind w:left="288" w:hanging="230"/>
-      </w:pPr>
-      <w:r>
-        <w:rPr>
-          <w:rFonts w:ascii="Helvetica Neue" w:hAnsi="Helvetica Neue"/>
-          <w:b/>
-          <w:i w:val="0"/>
-          <w:color w:val="3730A3"/>
-          <w:sz w:val="21"/>
-        </w:rPr>
-        <w:t xml:space="preserve">•  </w:t>
-      </w:r>
-      <w:r>
-        <w:rPr>
-          <w:rFonts w:ascii="Helvetica Neue" w:hAnsi="Helvetica Neue"/>
-          <w:b w:val="0"/>
-          <w:i w:val="0"/>
-          <w:color w:val="18181B"/>
-          <w:sz w:val="21"/>
-        </w:rPr>
-        <w:t>Two gates were verified by reverting their fix and watching them fail, because a green test that would pass anyway is worse than no test.</w:t>
+        <w:t>The close-up crops a person ruled before any threshold was tuned: 36 of 38 hard-graded cards agree.</w:t>
       </w:r>
     </w:p>
     <w:p>
@@ -2380,7 +2354,7 @@
           <w:color w:val="18181B"/>
           <w:sz w:val="20"/>
         </w:rPr>
-        <w:t>Rules only, which is what ships, sends 2 of 286 boxes to a person and settles everything else without an error.</w:t>
+        <w:t>Rules only, which is what ships, sends 2 of 286 graded boxes to a person and settles everything else without an error. The 286 graded boxes are the 287 detections on the brief pages minus the one on the tick the labeler ruled unsure.</w:t>
       </w:r>
     </w:p>
     <w:p>
@@ -2406,7 +2380,7 @@
           <w:color w:val="18181B"/>
           <w:sz w:val="20"/>
         </w:rPr>
-        <w:t>The CNN alone sends 56 and gets one settled box wrong; both together send 19, right on every box they settle.</w:t>
+        <w:t>The CNN alone sends 56 and gets 1 settled box wrong. Both together send 19, right on every box they settle.</w:t>
       </w:r>
     </w:p>
     <w:p>
@@ -2458,7 +2432,7 @@
           <w:color w:val="18181B"/>
           <w:sz w:val="21"/>
         </w:rPr>
-        <w:t>It caught nothing the rules missed and misread both real never-seen test boxes; switched on, it only adds work.</w:t>
+        <w:t>It caught nothing the rules missed. On the two hard boxes on the photographed page it settled neither, queuing the empty pen loop at p(filled) 0.845 and reading the filled faded X as empty at 0.082. Switched on, it only adds work.</w:t>
       </w:r>
     </w:p>
     <w:p>

</xml_diff>